<commit_message>
Add handoff documentation and reconciliation tools for Romania project
- Created `LASZLO_ROMANIA_HANDOFF.md` to outline responsibilities and immediate tasks for the new agent, LASZLO, taking over the Romania project.
- Introduced `EDUCATION_20261014_romania_all_county_offline_reconciliation.py` for offline reconciliation of saved county sources, ensuring accurate tracking of applicant and school-result records.
- Added a new Jupyter notebook `EDUCATION_20261014_Romania_2001_all_county_offline_reconciliation.ipynb` to facilitate the reconciliation process and provide clear instructions for usage.
- Updated `statistics.json` to include new session data reflecting user and agent interactions during the handoff.

These changes enhance the clarity of the handoff process and improve the tools available for ongoing analysis in the Romania project.
</commit_message>
<xml_diff>
--- a/3-Master_Plan/VECTOR_work/new_VECTOR_work/Model_Chapter_Shared_Working_Draft.docx
+++ b/3-Master_Plan/VECTOR_work/new_VECTOR_work/Model_Chapter_Shared_Working_Draft.docx
@@ -8248,7 +8248,23 @@
           <w:color w:val="auto"/>
           <w:szCs w:val="24"/>
         </w:rPr>
-        <w:t>First, write the denominator as a negative power:</w:t>
+        <w:t xml:space="preserve">First, </w:t>
+      </w:r>
+      <w:r>
+        <w:rPr>
+          <w:rFonts w:eastAsia="Times New Roman" w:cs="Times New Roman"/>
+          <w:color w:val="auto"/>
+          <w:szCs w:val="24"/>
+        </w:rPr>
+        <w:t>re</w:t>
+      </w:r>
+      <w:r>
+        <w:rPr>
+          <w:rFonts w:eastAsia="Times New Roman" w:cs="Times New Roman"/>
+          <w:color w:val="auto"/>
+          <w:szCs w:val="24"/>
+        </w:rPr>
+        <w:t>write the denominator as a negative power:</w:t>
       </w:r>
     </w:p>
     <w:p>
@@ -8871,7 +8887,15 @@
           <w:color w:val="auto"/>
           <w:szCs w:val="24"/>
         </w:rPr>
-        <w:t>The two negative signs cancel, leaving</w:t>
+        <w:t>T</w:t>
+      </w:r>
+      <w:r>
+        <w:rPr>
+          <w:rFonts w:eastAsia="Times New Roman" w:cs="Times New Roman"/>
+          <w:color w:val="auto"/>
+          <w:szCs w:val="24"/>
+        </w:rPr>
+        <w:t>his reduces to</w:t>
       </w:r>
     </w:p>
     <w:p>
@@ -9986,7 +10010,23 @@
           <w:color w:val="auto"/>
           <w:szCs w:val="24"/>
         </w:rPr>
-        <w:t>so the derivative simplifies to</w:t>
+        <w:t xml:space="preserve">so </w:t>
+      </w:r>
+      <w:r>
+        <w:rPr>
+          <w:rFonts w:eastAsia="Times New Roman" w:cs="Times New Roman"/>
+          <w:color w:val="auto"/>
+          <w:szCs w:val="24"/>
+        </w:rPr>
+        <w:t xml:space="preserve">we can simplify </w:t>
+      </w:r>
+      <w:r>
+        <w:rPr>
+          <w:rFonts w:eastAsia="Times New Roman" w:cs="Times New Roman"/>
+          <w:color w:val="auto"/>
+          <w:szCs w:val="24"/>
+        </w:rPr>
+        <w:t>the derivative to</w:t>
       </w:r>
     </w:p>
     <w:p>
@@ -10649,6 +10689,9 @@
             </m:sup>
           </m:sSup>
           <m:r>
+            <m:rPr>
+              <m:sty m:val="p"/>
+            </m:rPr>
             <w:rPr>
               <w:rFonts w:eastAsia="Times New Roman" w:cs="Times New Roman"/>
               <w:color w:val="auto"/>
@@ -10809,6 +10852,9 @@
       </w:r>
       <w:r>
         <w:t>Figure 4-1</w:t>
+      </w:r>
+      <w:r>
+        <w:noBreakHyphen/>
       </w:r>
       <w:r>
         <w:fldChar w:fldCharType="end"/>
@@ -10900,6 +10946,9 @@
       </w:r>
       <w:fldSimple w:instr=" SEQ Figure \* ARABIC ">
         <w:r>
+          <w:rPr>
+            <w:noProof/>
+          </w:rPr>
           <w:t>1</w:t>
         </w:r>
       </w:fldSimple>
@@ -11430,6 +11479,9 @@
       </w:r>
       <w:r>
         <w:t>Figure 4-2</w:t>
+      </w:r>
+      <w:r>
+        <w:noBreakHyphen/>
       </w:r>
       <w:r>
         <w:fldChar w:fldCharType="end"/>
@@ -11507,6 +11559,9 @@
       </w:r>
       <w:fldSimple w:instr=" SEQ Figure \* ARABIC ">
         <w:r>
+          <w:rPr>
+            <w:noProof/>
+          </w:rPr>
           <w:t>2</w:t>
         </w:r>
       </w:fldSimple>
@@ -14104,6 +14159,9 @@
         <w:t>Figure 4-3</w:t>
       </w:r>
       <w:r>
+        <w:noBreakHyphen/>
+      </w:r>
+      <w:r>
         <w:fldChar w:fldCharType="end"/>
       </w:r>
       <w:r>
@@ -14320,6 +14378,9 @@
       </w:r>
       <w:r>
         <w:t>Figure 4-3</w:t>
+      </w:r>
+      <w:r>
+        <w:noBreakHyphen/>
       </w:r>
       <w:r>
         <w:fldChar w:fldCharType="end"/>
@@ -14416,6 +14477,9 @@
       </w:r>
       <w:fldSimple w:instr=" SEQ Figure \* ARABIC ">
         <w:r>
+          <w:rPr>
+            <w:noProof/>
+          </w:rPr>
           <w:t>3</w:t>
         </w:r>
       </w:fldSimple>
@@ -14872,6 +14936,9 @@
       </w:r>
       <w:fldSimple w:instr=" SEQ Figure \* ARABIC ">
         <w:r>
+          <w:rPr>
+            <w:noProof/>
+          </w:rPr>
           <w:t>4</w:t>
         </w:r>
       </w:fldSimple>
@@ -14897,12 +14964,113 @@
         <w:t xml:space="preserve"> settings. Points show the percentage ever drafted. Error bars are pointwise 95% Wilson intervals without adjustment for team clustering. Counts indicate players and distinct team-seasons; open circles mark bins with fewer than 30 players. The panels use different vertical scales. These are descriptive associations.</w:t>
       </w:r>
     </w:p>
-    <w:p/>
+    <w:p>
+      <w:r>
+        <w:t xml:space="preserve">We can also examine selection within two differently defined bands of strong individual performance. </w:t>
+      </w:r>
+      <w:r>
+        <w:fldChar w:fldCharType="begin"/>
+      </w:r>
+      <w:r>
+        <w:instrText xml:space="preserve"> REF _Ref242867911 \h </w:instrText>
+      </w:r>
+      <w:r>
+        <w:fldChar w:fldCharType="separate"/>
+      </w:r>
+      <w:r>
+        <w:t>Figure 4-5</w:t>
+      </w:r>
+      <w:r>
+        <w:noBreakHyphen/>
+      </w:r>
+      <w:r>
+        <w:fldChar w:fldCharType="end"/>
+      </w:r>
+      <w:r>
+        <w:t xml:space="preserve"> compares players whose standardized performance lies between two and three standard deviations above the seasonal mean with players in the top 7% of the eligible performance distribution. Both panels show lower draft frequencies at the strongest peer environments than in several intermediate environments, although the estimates have substantial uncertainty. This illustration uses a different population from the preceding figure: it includes eligible player-seasons from 2011–2021, restricted to teams represented by at least one ever-drafted player. A player may therefore appear in more than one season. These patterns motivate closer examination of competition among strong performers; they do not establish a causal effect of congestion.</w:t>
+      </w:r>
+    </w:p>
+    <w:p>
+      <w:pPr>
+        <w:keepNext/>
+      </w:pPr>
+      <w:r>
+        <w:rPr>
+          <w:noProof/>
+        </w:rPr>
+        <w:lastRenderedPageBreak/>
+        <w:drawing>
+          <wp:inline distT="0" distB="0" distL="0" distR="0" wp14:anchorId="5BF34E12" wp14:editId="696A7BCD">
+            <wp:extent cx="5943600" cy="2795905"/>
+            <wp:effectExtent l="0" t="0" r="0" b="0"/>
+            <wp:docPr id="1624988306" name="Picture 1"/>
+            <wp:cNvGraphicFramePr>
+              <a:graphicFrameLocks xmlns:a="http://schemas.openxmlformats.org/drawingml/2006/main" noChangeAspect="1"/>
+            </wp:cNvGraphicFramePr>
+            <a:graphic xmlns:a="http://schemas.openxmlformats.org/drawingml/2006/main">
+              <a:graphicData uri="http://schemas.openxmlformats.org/drawingml/2006/picture">
+                <pic:pic xmlns:pic="http://schemas.openxmlformats.org/drawingml/2006/picture">
+                  <pic:nvPicPr>
+                    <pic:cNvPr id="1624988306" name="Picture 1624988306"/>
+                    <pic:cNvPicPr/>
+                  </pic:nvPicPr>
+                  <pic:blipFill>
+                    <a:blip r:embed="rId12"/>
+                    <a:stretch>
+                      <a:fillRect/>
+                    </a:stretch>
+                  </pic:blipFill>
+                  <pic:spPr>
+                    <a:xfrm>
+                      <a:off x="0" y="0"/>
+                      <a:ext cx="5943600" cy="2795905"/>
+                    </a:xfrm>
+                    <a:prstGeom prst="rect">
+                      <a:avLst/>
+                    </a:prstGeom>
+                  </pic:spPr>
+                </pic:pic>
+              </a:graphicData>
+            </a:graphic>
+          </wp:inline>
+        </w:drawing>
+      </w:r>
+    </w:p>
+    <w:p>
+      <w:pPr>
+        <w:pStyle w:val="Caption"/>
+      </w:pPr>
+      <w:bookmarkStart w:id="27" w:name="_Ref242867911"/>
+      <w:r>
+        <w:t>Figure 4-</w:t>
+      </w:r>
+      <w:fldSimple w:instr=" SEQ Figure \* ARABIC ">
+        <w:r>
+          <w:rPr>
+            <w:noProof/>
+          </w:rPr>
+          <w:t>5</w:t>
+        </w:r>
+      </w:fldSimple>
+      <w:bookmarkEnd w:id="27"/>
+      <w:r>
+        <w:t xml:space="preserve"> </w:t>
+      </w:r>
+      <w:r>
+        <w:rPr>
+          <w:rStyle w:val="Strong"/>
+        </w:rPr>
+        <w:t>Draft outcomes across peer environments within two high-performance bands.</w:t>
+      </w:r>
+      <w:r>
+        <w:t xml:space="preserve"> Individual performance is points per minute standardized within season. Panel A includes 425 player-season observations with performance between two and three standard deviations above the mean; Panel B includes 1,237 observations in the top 7%. Both use 2011–2021 and restrict teams to those represented by at least one ever-drafted player in the source window. The horizontal axis measures average teammate performance, excluding the focal player. The vertical axis reports the percentage of observations belonging to players who were ever drafted, rather than drafted in that particular season. Panel A uses 16 quantile bins; Panel B uses four lower-region bins and seven finer upper-region bins. Their bin boundaries differ. Counts beneath points report player-seasons. Error bars show pointwise 95% Wilson intervals without adjustment for repeated players or team clustering; open circles mark fewer than 30 observations. The performance bands overlap and are not independent samples.</w:t>
+      </w:r>
+    </w:p>
     <w:p>
       <w:pPr>
         <w:pStyle w:val="Heading1"/>
       </w:pPr>
-      <w:bookmarkStart w:id="27" w:name="Xace9f33b90814f9bd53ece6c999c09ae207edc6"/>
+      <w:bookmarkStart w:id="28" w:name="Xace9f33b90814f9bd53ece6c999c09ae207edc6"/>
       <w:bookmarkEnd w:id="14"/>
       <w:bookmarkEnd w:id="25"/>
       <w:r>
@@ -14916,11 +15084,7 @@
     </w:p>
     <w:p>
       <w:r>
-        <w:t xml:space="preserve">The assignment procedure supplies these artificial environments for simulation. It allows us to vary the tendency of similar individuals to join the same group while preserving the number of </w:t>
-      </w:r>
-      <w:r>
-        <w:lastRenderedPageBreak/>
-        <w:t>individuals and each group’s roster capacity. Assignment is therefore a device for studying the consequences of group composition. The scoring and selection model can also operate on observed groups without generating new memberships</w:t>
+        <w:t>The assignment procedure supplies these artificial environments for simulation. It allows us to vary the tendency of similar individuals to join the same group while preserving the number of individuals and each group’s roster capacity. Assignment is therefore a device for studying the consequences of group composition. The scoring and selection model can also operate on observed groups without generating new memberships</w:t>
       </w:r>
       <w:r>
         <w:t>.</w:t>
@@ -14930,8 +15094,9 @@
       <w:pPr>
         <w:pStyle w:val="Heading2"/>
       </w:pPr>
-      <w:bookmarkStart w:id="28" w:name="why-an-assignment-mechanism-is-needed"/>
-      <w:r>
+      <w:bookmarkStart w:id="29" w:name="why-an-assignment-mechanism-is-needed"/>
+      <w:r>
+        <w:lastRenderedPageBreak/>
         <w:t xml:space="preserve">4.6.1 </w:t>
       </w:r>
       <w:r>
@@ -15129,8 +15294,8 @@
       <w:pPr>
         <w:pStyle w:val="Heading2"/>
       </w:pPr>
-      <w:bookmarkStart w:id="29" w:name="X3819545970a9b5cccbdae8e4b8b7e3182042c91"/>
-      <w:bookmarkEnd w:id="28"/>
+      <w:bookmarkStart w:id="30" w:name="X3819545970a9b5cccbdae8e4b8b7e3182042c91"/>
+      <w:bookmarkEnd w:id="29"/>
       <w:r>
         <w:t>4.6.2 Sequential assignment with evolving centroids</w:t>
       </w:r>
@@ -15210,7 +15375,6 @@
         <w:pStyle w:val="BodyText"/>
       </w:pPr>
       <w:r>
-        <w:lastRenderedPageBreak/>
         <w:t>Individuals are processed in a randomly ordered sequence. When an individual is considered for assignment, each group’s probability depends on two quantities: how many places it still has available and how similar its current centroid is to that individual’s performance.</w:t>
       </w:r>
     </w:p>
@@ -15219,6 +15383,7 @@
         <w:pStyle w:val="BodyText"/>
       </w:pPr>
       <w:r>
+        <w:lastRenderedPageBreak/>
         <w:t xml:space="preserve">Let </w:t>
       </w:r>
       <m:oMath>
@@ -16407,7 +16572,6 @@
     </w:p>
     <w:p>
       <w:r>
-        <w:lastRenderedPageBreak/>
         <w:fldChar w:fldCharType="begin"/>
       </w:r>
       <w:r>
@@ -16417,7 +16581,10 @@
         <w:fldChar w:fldCharType="separate"/>
       </w:r>
       <w:r>
-        <w:t>Figure 4-5</w:t>
+        <w:t>Figure 4-6</w:t>
+      </w:r>
+      <w:r>
+        <w:noBreakHyphen/>
       </w:r>
       <w:r>
         <w:fldChar w:fldCharType="end"/>
@@ -16440,6 +16607,7 @@
         <w:rPr>
           <w:noProof/>
         </w:rPr>
+        <w:lastRenderedPageBreak/>
         <w:drawing>
           <wp:inline distT="0" distB="0" distL="0" distR="0" wp14:anchorId="3F63DFCE" wp14:editId="3E89054F">
             <wp:extent cx="5943600" cy="5085080"/>
@@ -16456,7 +16624,7 @@
                     <pic:cNvPicPr/>
                   </pic:nvPicPr>
                   <pic:blipFill>
-                    <a:blip r:embed="rId12"/>
+                    <a:blip r:embed="rId13"/>
                     <a:stretch>
                       <a:fillRect/>
                     </a:stretch>
@@ -16481,16 +16649,19 @@
       <w:pPr>
         <w:pStyle w:val="Caption"/>
       </w:pPr>
-      <w:bookmarkStart w:id="30" w:name="Chapter4Figure4"/>
+      <w:bookmarkStart w:id="31" w:name="Chapter4Figure4"/>
       <w:r>
         <w:t>Figure 4-</w:t>
       </w:r>
       <w:fldSimple w:instr=" SEQ Figure \* ARABIC ">
         <w:r>
-          <w:t>5</w:t>
+          <w:rPr>
+            <w:noProof/>
+          </w:rPr>
+          <w:t>6</w:t>
         </w:r>
       </w:fldSimple>
-      <w:bookmarkEnd w:id="30"/>
+      <w:bookmarkEnd w:id="31"/>
       <w:r>
         <w:t xml:space="preserve">. </w:t>
       </w:r>
@@ -16614,11 +16785,7 @@
         </m:r>
       </m:oMath>
       <w:r>
-        <w:t xml:space="preserve">, the similarity terms all equal one. Assignment probabilities then reduce to remaining group capacity divided by total remaining capacity. This is equivalent to choosing uniformly </w:t>
-      </w:r>
-      <w:r>
-        <w:lastRenderedPageBreak/>
-        <w:t xml:space="preserve">among all remaining membership places. Positive </w:t>
+        <w:t xml:space="preserve">, the similarity terms all equal one. Assignment probabilities then reduce to remaining group capacity divided by total remaining capacity. This is equivalent to choosing uniformly among all remaining membership places. Positive </w:t>
       </w:r>
       <m:oMath>
         <m:r>
@@ -16636,9 +16803,10 @@
       <w:pPr>
         <w:pStyle w:val="Heading2"/>
       </w:pPr>
-      <w:bookmarkStart w:id="31" w:name="preference-and-realized-sorting"/>
-      <w:bookmarkEnd w:id="29"/>
-      <w:r>
+      <w:bookmarkStart w:id="32" w:name="preference-and-realized-sorting"/>
+      <w:bookmarkEnd w:id="30"/>
+      <w:r>
+        <w:lastRenderedPageBreak/>
         <w:t xml:space="preserve">4.6.3 </w:t>
       </w:r>
       <w:r>
@@ -16694,7 +16862,82 @@
         <w:pStyle w:val="BodyText"/>
       </w:pPr>
       <w:r>
-        <w:t>We summarize this pattern using</w:t>
+        <w:t xml:space="preserve">We </w:t>
+      </w:r>
+      <w:r>
+        <w:t xml:space="preserve">summarize this assortativity pattern, we introduce the term </w:t>
+      </w:r>
+      <m:oMath>
+        <m:sSub>
+          <m:sSubPr>
+            <m:ctrlPr>
+              <w:rPr>
+                <w:rFonts w:ascii="Cambria Math" w:hAnsi="Cambria Math"/>
+              </w:rPr>
+            </m:ctrlPr>
+          </m:sSubPr>
+          <m:e>
+            <m:r>
+              <w:rPr>
+                <w:rFonts w:ascii="Cambria Math" w:hAnsi="Cambria Math"/>
+              </w:rPr>
+              <m:t>H</m:t>
+            </m:r>
+          </m:e>
+          <m:sub>
+            <m:r>
+              <m:rPr>
+                <m:sty m:val="p"/>
+              </m:rPr>
+              <w:rPr>
+                <w:rFonts w:ascii="Cambria Math" w:hAnsi="Cambria Math"/>
+              </w:rPr>
+              <m:t>sort</m:t>
+            </m:r>
+          </m:sub>
+        </m:sSub>
+      </m:oMath>
+      <w:r>
+        <w:t xml:space="preserve"> </w:t>
+      </w:r>
+      <w:r>
+        <w:t xml:space="preserve">which </w:t>
+      </w:r>
+      <w:r>
+        <w:t xml:space="preserve">measures the fraction of variation in individual performance that lies between groups rather than within them.  It tells us how strongly individuals are sorted into groups by performance: when group membership tells us little about an individual’s performance, </w:t>
+      </w:r>
+      <m:oMath>
+        <m:sSub>
+          <m:sSubPr>
+            <m:ctrlPr>
+              <w:rPr>
+                <w:rFonts w:ascii="Cambria Math" w:hAnsi="Cambria Math"/>
+              </w:rPr>
+            </m:ctrlPr>
+          </m:sSubPr>
+          <m:e>
+            <m:r>
+              <w:rPr>
+                <w:rFonts w:ascii="Cambria Math" w:hAnsi="Cambria Math"/>
+              </w:rPr>
+              <m:t>H</m:t>
+            </m:r>
+          </m:e>
+          <m:sub>
+            <m:r>
+              <m:rPr>
+                <m:sty m:val="p"/>
+              </m:rPr>
+              <w:rPr>
+                <w:rFonts w:ascii="Cambria Math" w:hAnsi="Cambria Math"/>
+              </w:rPr>
+              <m:t>sort</m:t>
+            </m:r>
+          </m:sub>
+        </m:sSub>
+      </m:oMath>
+      <w:r>
+        <w:t xml:space="preserve"> is low; when groups contain individuals with similar performance and differ substantially from one another, it is high.  </w:t>
       </w:r>
     </w:p>
     <w:p>
@@ -18341,8 +18584,8 @@
       <w:pPr>
         <w:pStyle w:val="Heading2"/>
       </w:pPr>
-      <w:bookmarkStart w:id="32" w:name="X1ad203f4aedc8fcded9afae827919e65ec1bf18"/>
-      <w:bookmarkEnd w:id="31"/>
+      <w:bookmarkStart w:id="33" w:name="X1ad203f4aedc8fcded9afae827919e65ec1bf18"/>
+      <w:bookmarkEnd w:id="32"/>
       <w:r>
         <w:t xml:space="preserve">4.6.4 </w:t>
       </w:r>
@@ -18386,9 +18629,9 @@
       <w:pPr>
         <w:pStyle w:val="Heading1"/>
       </w:pPr>
-      <w:bookmarkStart w:id="33" w:name="X3c3c4c0997d1df4bc4320797fc414201263c54a"/>
-      <w:bookmarkEnd w:id="27"/>
-      <w:bookmarkEnd w:id="32"/>
+      <w:bookmarkStart w:id="34" w:name="X3c3c4c0997d1df4bc4320797fc414201263c54a"/>
+      <w:bookmarkEnd w:id="28"/>
+      <w:bookmarkEnd w:id="33"/>
       <w:r>
         <w:t>4.7 What the completed mechanism experiments establish</w:t>
       </w:r>
@@ -18402,7 +18645,7 @@
       <w:pPr>
         <w:pStyle w:val="Heading2"/>
       </w:pPr>
-      <w:bookmarkStart w:id="34" w:name="experimental-setting-and-interpretation"/>
+      <w:bookmarkStart w:id="35" w:name="experimental-setting-and-interpretation"/>
       <w:r>
         <w:t>4.7.1 Experimental setting and interpretation</w:t>
       </w:r>
@@ -18476,8 +18719,8 @@
       <w:pPr>
         <w:pStyle w:val="Heading2"/>
       </w:pPr>
-      <w:bookmarkStart w:id="35" w:name="X2bdcce90be781303280a4b078df70adb92028df"/>
-      <w:bookmarkEnd w:id="34"/>
+      <w:bookmarkStart w:id="36" w:name="X2bdcce90be781303280a4b078df70adb92028df"/>
+      <w:bookmarkEnd w:id="35"/>
       <w:r>
         <w:t>4.7.2 Congestion can change winners without similarity preference</w:t>
       </w:r>
@@ -18559,8 +18802,8 @@
       <w:pPr>
         <w:pStyle w:val="Heading2"/>
       </w:pPr>
-      <w:bookmarkStart w:id="36" w:name="X97d9df95a828479ab0f1857fc0478829051bfc4"/>
-      <w:bookmarkEnd w:id="35"/>
+      <w:bookmarkStart w:id="37" w:name="X97d9df95a828479ab0f1857fc0478829051bfc4"/>
+      <w:bookmarkEnd w:id="36"/>
       <w:r>
         <w:t>4.7.3 Penalty strength and the visibility of the tail</w:t>
       </w:r>
@@ -18668,7 +18911,11 @@
       </w:r>
       <w:r>
         <w:lastRenderedPageBreak/>
-        <w:t>solely the last bar, but its outermost estimates were supported by few observations.</w:t>
+        <w:t xml:space="preserve">solely the last bar, but its outermost estimates were supported by few </w:t>
+      </w:r>
+      <w:proofErr w:type="spellStart"/>
+      <w:r>
+        <w:t>observations.</w:t>
       </w:r>
       <w:r>
         <w:fldChar w:fldCharType="begin"/>
@@ -18680,7 +18927,14 @@
         <w:fldChar w:fldCharType="separate"/>
       </w:r>
       <w:r>
-        <w:t>Figure 4-6</w:t>
+        <w:t>Figure</w:t>
+      </w:r>
+      <w:proofErr w:type="spellEnd"/>
+      <w:r>
+        <w:t xml:space="preserve"> 4-7</w:t>
+      </w:r>
+      <w:r>
+        <w:noBreakHyphen/>
       </w:r>
       <w:r>
         <w:fldChar w:fldCharType="end"/>
@@ -18723,7 +18977,7 @@
                     </pic:cNvPicPr>
                   </pic:nvPicPr>
                   <pic:blipFill>
-                    <a:blip r:embed="rId13"/>
+                    <a:blip r:embed="rId14"/>
                     <a:stretch>
                       <a:fillRect/>
                     </a:stretch>
@@ -18755,16 +19009,19 @@
         <w:pStyle w:val="Caption"/>
         <w:spacing w:line="240" w:lineRule="auto"/>
       </w:pPr>
-      <w:bookmarkStart w:id="37" w:name="Chapter4Figure5"/>
+      <w:bookmarkStart w:id="38" w:name="Chapter4Figure5"/>
       <w:r>
         <w:t>Figure 4-</w:t>
       </w:r>
       <w:fldSimple w:instr=" SEQ Figure \* ARABIC ">
         <w:r>
-          <w:t>6</w:t>
+          <w:rPr>
+            <w:noProof/>
+          </w:rPr>
+          <w:t>7</w:t>
         </w:r>
       </w:fldSimple>
-      <w:bookmarkEnd w:id="37"/>
+      <w:bookmarkEnd w:id="38"/>
       <w:r>
         <w:t xml:space="preserve">.  Penalty strength and binning in the 2015 simulation. Rows compare </w:t>
       </w:r>
@@ -18810,8 +19067,8 @@
       <w:pPr>
         <w:pStyle w:val="Heading2"/>
       </w:pPr>
-      <w:bookmarkStart w:id="38" w:name="assignment-preference-and-scarcity"/>
-      <w:bookmarkEnd w:id="36"/>
+      <w:bookmarkStart w:id="39" w:name="assignment-preference-and-scarcity"/>
+      <w:bookmarkEnd w:id="37"/>
       <w:r>
         <w:lastRenderedPageBreak/>
         <w:t>4.7.4 Assignment preference and scarcity</w:t>
@@ -18909,7 +19166,10 @@
         <w:fldChar w:fldCharType="separate"/>
       </w:r>
       <w:r>
-        <w:t>Figure 4-7</w:t>
+        <w:t>Figure 4-8</w:t>
+      </w:r>
+      <w:r>
+        <w:noBreakHyphen/>
       </w:r>
       <w:r>
         <w:fldChar w:fldCharType="end"/>
@@ -18960,7 +19220,7 @@
                     </pic:cNvPicPr>
                   </pic:nvPicPr>
                   <pic:blipFill>
-                    <a:blip r:embed="rId14"/>
+                    <a:blip r:embed="rId15"/>
                     <a:stretch>
                       <a:fillRect/>
                     </a:stretch>
@@ -18992,16 +19252,19 @@
         <w:pStyle w:val="Caption"/>
         <w:spacing w:line="240" w:lineRule="auto"/>
       </w:pPr>
-      <w:bookmarkStart w:id="39" w:name="Chapter4Figure6"/>
+      <w:bookmarkStart w:id="40" w:name="Chapter4Figure6"/>
       <w:r>
         <w:t>Figure 4-</w:t>
       </w:r>
       <w:fldSimple w:instr=" SEQ Figure \* ARABIC ">
         <w:r>
-          <w:t>7</w:t>
+          <w:rPr>
+            <w:noProof/>
+          </w:rPr>
+          <w:t>8</w:t>
         </w:r>
       </w:fldSimple>
-      <w:bookmarkEnd w:id="39"/>
+      <w:bookmarkEnd w:id="40"/>
       <w:r>
         <w:t xml:space="preserve">.  Assignment preference under two levels of scarcity in the 2015 simulation. The upper two rows show selection near 50%; the lower two show selection near 1%. Red indicates </w:t>
       </w:r>
@@ -19088,8 +19351,8 @@
       <w:pPr>
         <w:pStyle w:val="Heading2"/>
       </w:pPr>
-      <w:bookmarkStart w:id="40" w:name="what-remains-to-be-established"/>
-      <w:bookmarkEnd w:id="38"/>
+      <w:bookmarkStart w:id="41" w:name="what-remains-to-be-established"/>
+      <w:bookmarkEnd w:id="39"/>
       <w:r>
         <w:t>4.7.5 What remains to be established</w:t>
       </w:r>
@@ -19204,9 +19467,9 @@
       <w:pPr>
         <w:pStyle w:val="Heading1"/>
       </w:pPr>
-      <w:bookmarkStart w:id="41" w:name="the-bridge-to-empirical-fitting"/>
-      <w:bookmarkEnd w:id="33"/>
-      <w:bookmarkEnd w:id="40"/>
+      <w:bookmarkStart w:id="42" w:name="the-bridge-to-empirical-fitting"/>
+      <w:bookmarkEnd w:id="34"/>
+      <w:bookmarkEnd w:id="41"/>
       <w:r>
         <w:t>4.8 The bridge to empirical fitting</w:t>
       </w:r>
@@ -21390,8 +21653,8 @@
       <w:pPr>
         <w:pStyle w:val="Heading1"/>
       </w:pPr>
-      <w:bookmarkStart w:id="42" w:name="X34faad1c749316954420b934931aff7c96ea3d6"/>
-      <w:bookmarkEnd w:id="41"/>
+      <w:bookmarkStart w:id="43" w:name="X34faad1c749316954420b934931aff7c96ea3d6"/>
+      <w:bookmarkEnd w:id="42"/>
       <w:r>
         <w:t>Appendix 4A Technical qualifications and the historical fitting record</w:t>
       </w:r>
@@ -21400,7 +21663,7 @@
       <w:pPr>
         <w:pStyle w:val="Heading2"/>
       </w:pPr>
-      <w:bookmarkStart w:id="43" w:name="Xc4cff8260d0316924cc51552c5cb860d3737775"/>
+      <w:bookmarkStart w:id="44" w:name="Xc4cff8260d0316924cc51552c5cb860d3737775"/>
       <w:r>
         <w:t>4A.1 The intended stochastic rule and legacy software</w:t>
       </w:r>
@@ -21472,8 +21735,8 @@
       <w:pPr>
         <w:pStyle w:val="Heading2"/>
       </w:pPr>
-      <w:bookmarkStart w:id="44" w:name="X30020ca2e28c3ddcf47702a707f4f0d8976e712"/>
-      <w:bookmarkEnd w:id="43"/>
+      <w:bookmarkStart w:id="45" w:name="X30020ca2e28c3ddcf47702a707f4f0d8976e712"/>
+      <w:bookmarkEnd w:id="44"/>
       <w:r>
         <w:t>4A.2 Differences between the stated selection rule and earlier implementations</w:t>
       </w:r>
@@ -21585,15 +21848,7 @@
         </m:sSub>
       </m:oMath>
       <w:r>
-        <w:t xml:space="preserve"> indicated whether the player was ever drafted. The fitting panel retained all eligible player-season observations rather than restricting outcomes to one final-season observation per athlete. Accordingly, the same eventual draft outcome could appear on several rows belonging to one player. These are the observational units of the historical fit; they should not be described as independent annual draft decisions or as distinct draft selections merely because the likelihood multiplies contributions across ro</w:t>
-      </w:r>
-      <w:proofErr w:type="spellStart"/>
-      <w:r>
-        <w:t>ws</w:t>
-      </w:r>
-      <w:proofErr w:type="spellEnd"/>
-      <w:r>
-        <w:t>. A revision intended to model annual selection would need to establish a corresponding eligible population and outcome timing. [5]</w:t>
+        <w:t xml:space="preserve"> indicated whether the player was ever drafted. The fitting panel retained all eligible player-season observations rather than restricting outcomes to one final-season observation per athlete. Accordingly, the same eventual draft outcome could appear on several rows belonging to one player. These are the observational units of the historical fit; they should not be described as independent annual draft decisions or as distinct draft selections merely because the likelihood multiplies contributions across rows. A revision intended to model annual selection would need to establish a corresponding eligible population and outcome timing. [5]</w:t>
       </w:r>
     </w:p>
     <w:p>
@@ -23906,8 +24161,8 @@
       <w:pPr>
         <w:pStyle w:val="Heading2"/>
       </w:pPr>
-      <w:bookmarkStart w:id="45" w:name="X61c80e37b1d723545285bb680c26300a41eba3a"/>
-      <w:bookmarkEnd w:id="44"/>
+      <w:bookmarkStart w:id="46" w:name="X61c80e37b1d723545285bb680c26300a41eba3a"/>
+      <w:bookmarkEnd w:id="45"/>
       <w:r>
         <w:t>4A.3 Normalization and threshold construction</w:t>
       </w:r>
@@ -24338,15 +24593,7 @@
         </m:sSub>
       </m:oMath>
       <w:r>
-        <w:t xml:space="preserve"> individuals. This is the historical working Bernoulli specification, but its normalization does not match a season containing many observed positive outcomes. Consequently, the saved probabilities should not be presented as validated individual draft probabilities. What remains to be established is whether this objective is defensible as a working calibration criterion for the intended scientific comparison, or whether a different outcome likelihood and observational unit are required. Neither a satisfacto</w:t>
-      </w:r>
-      <w:proofErr w:type="spellStart"/>
-      <w:r>
-        <w:t>ry</w:t>
-      </w:r>
-      <w:proofErr w:type="spellEnd"/>
-      <w:r>
-        <w:t xml:space="preserve"> ranking diagnostic nor a successful optimizer convergence message resolves that question.</w:t>
+        <w:t xml:space="preserve"> individuals. This is the historical working Bernoulli specification, but its normalization does not match a season containing many observed positive outcomes. Consequently, the saved probabilities should not be presented as validated individual draft probabilities. What remains to be established is whether this objective is defensible as a working calibration criterion for the intended scientific comparison, or whether a different outcome likelihood and observational unit are required. Neither a satisfactory ranking diagnostic nor a successful optimizer convergence message resolves that question.</w:t>
       </w:r>
     </w:p>
     <w:p>
@@ -24897,8 +25144,8 @@
       <w:pPr>
         <w:pStyle w:val="Heading2"/>
       </w:pPr>
-      <w:bookmarkStart w:id="46" w:name="X37bb242055bc516b188ab4496a584a40b1a9c72"/>
-      <w:bookmarkEnd w:id="45"/>
+      <w:bookmarkStart w:id="47" w:name="X37bb242055bc516b188ab4496a584a40b1a9c72"/>
+      <w:bookmarkEnd w:id="46"/>
       <w:r>
         <w:t>4A.4 Saved estimates and parameter transfer</w:t>
       </w:r>
@@ -25967,8 +26214,8 @@
       <w:pPr>
         <w:pStyle w:val="Heading2"/>
       </w:pPr>
-      <w:bookmarkStart w:id="47" w:name="Xc89fd0d0a0538ad258b22b5118afea5b3189c30"/>
-      <w:bookmarkEnd w:id="46"/>
+      <w:bookmarkStart w:id="48" w:name="Xc89fd0d0a0538ad258b22b5118afea5b3189c30"/>
+      <w:bookmarkEnd w:id="47"/>
       <w:r>
         <w:lastRenderedPageBreak/>
         <w:t>4A.5 Alternative congestion specifications</w:t>
@@ -26778,9 +27025,9 @@
       <w:pPr>
         <w:pStyle w:val="Heading1"/>
       </w:pPr>
-      <w:bookmarkStart w:id="48" w:name="X8a33aa523801c967d2fea04397cc8e7252f71fa"/>
-      <w:bookmarkEnd w:id="42"/>
-      <w:bookmarkEnd w:id="47"/>
+      <w:bookmarkStart w:id="49" w:name="X8a33aa523801c967d2fea04397cc8e7252f71fa"/>
+      <w:bookmarkEnd w:id="43"/>
+      <w:bookmarkEnd w:id="48"/>
       <w:r>
         <w:lastRenderedPageBreak/>
         <w:t>Appendix 4B Sources for the equations and completed results</w:t>
@@ -26798,7 +27045,7 @@
       <w:r>
         <w:t xml:space="preserve">[1] The stochastic replay decision and distinction between temperatures are documented in </w:t>
       </w:r>
-      <w:hyperlink r:id="rId15">
+      <w:hyperlink r:id="rId16">
         <w:r>
           <w:t>MBB_empirical_roster_select_replay.md</w:t>
         </w:r>
@@ -26806,7 +27053,7 @@
       <w:r>
         <w:t xml:space="preserve">, lines 370–418 and 454–462. The direct user instruction is preserved in </w:t>
       </w:r>
-      <w:hyperlink r:id="rId16">
+      <w:hyperlink r:id="rId17">
         <w:r>
           <w:t>.</w:t>
         </w:r>
@@ -26830,7 +27077,7 @@
       <w:r>
         <w:t xml:space="preserve">[2] </w:t>
       </w:r>
-      <w:hyperlink r:id="rId17">
+      <w:hyperlink r:id="rId18">
         <w:r>
           <w:t>PD20_softmax_K_winners_explainer.md</w:t>
         </w:r>
@@ -26838,7 +27085,7 @@
       <w:r>
         <w:t xml:space="preserve">, lines 190–199, describes the observed-set likelihood for sequential proportional sampling. </w:t>
       </w:r>
-      <w:hyperlink r:id="rId18">
+      <w:hyperlink r:id="rId19">
         <w:r>
           <w:t>PD20_notes.md</w:t>
         </w:r>
@@ -26854,7 +27101,7 @@
       <w:r>
         <w:t xml:space="preserve">[3] </w:t>
       </w:r>
-      <w:hyperlink r:id="rId19">
+      <w:hyperlink r:id="rId20">
         <w:r>
           <w:t>sports/tier1_pool_assignment.py</w:t>
         </w:r>
@@ -26870,7 +27117,7 @@
       <w:r>
         <w:t xml:space="preserve">[4] </w:t>
       </w:r>
-      <w:hyperlink r:id="rId20">
+      <w:hyperlink r:id="rId21">
         <w:r>
           <w:t>sports/scripts/pd21_draft_bernoulli_mle.py</w:t>
         </w:r>
@@ -26886,7 +27133,7 @@
       <w:r>
         <w:t xml:space="preserve">[5] </w:t>
       </w:r>
-      <w:hyperlink r:id="rId21">
+      <w:hyperlink r:id="rId22">
         <w:r>
           <w:t>ASSORT_20260927_SCOUT_response_selection_population_and_reigning_alignment.md</w:t>
         </w:r>
@@ -26894,7 +27141,7 @@
       <w:r>
         <w:t xml:space="preserve">, lines 94–115, documents all-player-season rows and repeated ever-drafted labels. The loader is </w:t>
       </w:r>
-      <w:hyperlink r:id="rId22">
+      <w:hyperlink r:id="rId23">
         <w:r>
           <w:t>sports/scripts/grandchild_selection_inverted_u_diagnostic.py</w:t>
         </w:r>
@@ -26914,7 +27161,7 @@
       <w:r>
         <w:t xml:space="preserve">[6] </w:t>
       </w:r>
-      <w:hyperlink r:id="rId23">
+      <w:hyperlink r:id="rId24">
         <w:r>
           <w:t>sports/tier1_pool_assignment.py</w:t>
         </w:r>
@@ -26922,7 +27169,7 @@
       <w:r>
         <w:t xml:space="preserve">, lines 772–781 and 870–912, implements logistic viability and full-team mean congestion. It clips the logistic argument to -500, 500 for numerical stability. The distinction from the leave-one-out HERO axis also appears in </w:t>
       </w:r>
-      <w:hyperlink r:id="rId24">
+      <w:hyperlink r:id="rId25">
         <w:r>
           <w:t>MBB_empirical_roster_select_replay.md</w:t>
         </w:r>
@@ -26938,7 +27185,7 @@
       <w:r>
         <w:t xml:space="preserve">[7] </w:t>
       </w:r>
-      <w:hyperlink r:id="rId25">
+      <w:hyperlink r:id="rId26">
         <w:r>
           <w:t>sports/scripts/grandchild_selection_inverted_u_diagnostic.py</w:t>
         </w:r>
@@ -26954,7 +27201,7 @@
       <w:r>
         <w:t xml:space="preserve">[8] </w:t>
       </w:r>
-      <w:hyperlink r:id="rId26">
+      <w:hyperlink r:id="rId27">
         <w:r>
           <w:t>REIGNING_PD21_rho_hsort_calibrate_2009_2021_mg10_min20_09_21_fit_bracket.json</w:t>
         </w:r>
@@ -26986,7 +27233,7 @@
       <w:r>
         <w:t xml:space="preserve">[9] </w:t>
       </w:r>
-      <w:hyperlink r:id="rId27">
+      <w:hyperlink r:id="rId28">
         <w:r>
           <w:t>REIGNING_PD21_draft_bernoulli_mle_2009_2021_mg10_min20_09_21.json</w:t>
         </w:r>
@@ -26994,7 +27241,7 @@
       <w:r>
         <w:t xml:space="preserve">, lines 2–21 and 76–85, supplies the date, window label, counts, estimates, objective value, and convergence flag. Full stored estimates are gamma = 19.572332081866243, lambda = 1.3024305834948529, t = 1.0698967300656186, and log-likelihood = -8865.70116078651. The campaign label is also in </w:t>
       </w:r>
-      <w:hyperlink r:id="rId28">
+      <w:hyperlink r:id="rId29">
         <w:r>
           <w:t>calibration/</w:t>
         </w:r>
@@ -27007,7 +27254,7 @@
       <w:r>
         <w:t xml:space="preserve">. </w:t>
       </w:r>
-      <w:hyperlink r:id="rId29">
+      <w:hyperlink r:id="rId30">
         <w:r>
           <w:t>sports/scripts/reigning_hero_calibration.py</w:t>
         </w:r>
@@ -27023,7 +27270,7 @@
       <w:r>
         <w:t xml:space="preserve">[10] </w:t>
       </w:r>
-      <w:hyperlink r:id="rId30">
+      <w:hyperlink r:id="rId31">
         <w:r>
           <w:t>PD21_draft_bernoulli_mle_2013_2021.json</w:t>
         </w:r>
@@ -27031,7 +27278,7 @@
       <w:r>
         <w:t xml:space="preserve">, lines 2–21, records the fixed-gamma fit: gamma = 18, lambda = 2.571500648851351, t = 1.065561586816066, 38,123 rows, 882 positive flags, and nine seasons. The older </w:t>
       </w:r>
-      <w:hyperlink r:id="rId31">
+      <w:hyperlink r:id="rId32">
         <w:r>
           <w:t>PD21_draft_bernoulli_mle_2011_2021.json</w:t>
         </w:r>
@@ -27055,7 +27302,7 @@
       <w:r>
         <w:t xml:space="preserve">[11] </w:t>
       </w:r>
-      <w:hyperlink r:id="rId32">
+      <w:hyperlink r:id="rId33">
         <w:r>
           <w:t>MBB_empirical_roster_select_replay.md</w:t>
         </w:r>
@@ -27083,7 +27330,7 @@
         <w:lastRenderedPageBreak/>
         <w:t xml:space="preserve">[12] </w:t>
       </w:r>
-      <w:hyperlink r:id="rId33">
+      <w:hyperlink r:id="rId34">
         <w:r>
           <w:t>MLE_basics.md</w:t>
         </w:r>
@@ -27110,7 +27357,7 @@
       <w:r>
         <w:t xml:space="preserve">[13] </w:t>
       </w:r>
-      <w:hyperlink r:id="rId34">
+      <w:hyperlink r:id="rId35">
         <w:r>
           <w:t>VECTOR_PD44_Dissertation_Work_Map_and_Model_Chapter_Outline.md</w:t>
         </w:r>
@@ -27179,7 +27426,10 @@
         <w:fldChar w:fldCharType="separate"/>
       </w:r>
       <w:r>
-        <w:t>Figure 4-6</w:t>
+        <w:t>Figure 4-7</w:t>
+      </w:r>
+      <w:r>
+        <w:noBreakHyphen/>
       </w:r>
       <w:r>
         <w:fldChar w:fldCharType="end"/>
@@ -27239,7 +27489,10 @@
         <w:fldChar w:fldCharType="separate"/>
       </w:r>
       <w:r>
-        <w:t>Figure 4-7</w:t>
+        <w:t>Figure 4-8</w:t>
+      </w:r>
+      <w:r>
+        <w:noBreakHyphen/>
       </w:r>
       <w:r>
         <w:fldChar w:fldCharType="end"/>
@@ -27255,11 +27508,11 @@
       <w:r>
         <w:t>/outputs/rho_scarcity_v1. The report links the saved rates, population support, identity summaries, and run record.</w:t>
       </w:r>
-      <w:bookmarkEnd w:id="48"/>
+      <w:bookmarkEnd w:id="49"/>
     </w:p>
     <w:sectPr>
-      <w:headerReference w:type="default" r:id="rId35"/>
-      <w:footerReference w:type="default" r:id="rId36"/>
+      <w:headerReference w:type="default" r:id="rId36"/>
+      <w:footerReference w:type="default" r:id="rId37"/>
       <w:pgSz w:w="12240" w:h="15840"/>
       <w:pgMar w:top="1440" w:right="1440" w:bottom="1440" w:left="1440" w:header="504" w:footer="504" w:gutter="0"/>
       <w:cols w:space="720"/>
@@ -29074,6 +29327,7 @@
   <w:style w:type="character" w:default="1" w:styleId="DefaultParagraphFont">
     <w:name w:val="Default Paragraph Font"/>
     <w:uiPriority w:val="1"/>
+    <w:semiHidden/>
     <w:unhideWhenUsed/>
   </w:style>
   <w:style w:type="table" w:default="1" w:styleId="TableNormal">

</xml_diff>